<commit_message>
Redesign billing around structured work selections
</commit_message>
<xml_diff>
--- a/templates/Domestic Violence Affidavit.docx
+++ b/templates/Domestic Violence Affidavit.docx
@@ -1873,7 +1873,7 @@
         <w:rPr>
           <w:lang w:val="en-GB"/>
         </w:rPr>
-        <w:t>The Application for a Protection Order is being made without notice to the Respondent because the delay that would be caused by proceeding on notice would or might entail a risk of harm and undue hardship to me as follows:</w:t>
+        <w:t>The Application for a Protection Order is being made without notice to the Respondent because the delay that would be caused by proceeding on notice would or might entail a risk of harm and undue hardship to me and the children of my family as follows:</w:t>
       </w:r>
     </w:p>
     <w:p>
@@ -1891,13 +1891,13 @@
         <w:rPr>
           <w:lang w:val="en-GB"/>
         </w:rPr>
-        <w:t>I am very fearful for my safety</w:t>
-      </w:r>
-      <w:r>
-        <w:rPr>
-          <w:lang w:val="en-GB"/>
-        </w:rPr>
-        <w:t xml:space="preserve">. </w:t>
+        <w:t>I am very fearful for my safety and also the children’s safety.</w:t>
+      </w:r>
+      <w:r>
+        <w:rPr>
+          <w:lang w:val="en-GB"/>
+        </w:rPr>
+        <w:t xml:space="preserve"/>
       </w:r>
     </w:p>
     <w:p>

</xml_diff>

<commit_message>
Refine affidavit and billing form output
</commit_message>
<xml_diff>
--- a/templates/Domestic Violence Affidavit.docx
+++ b/templates/Domestic Violence Affidavit.docx
@@ -134,19 +134,7 @@
         <w:rPr>
           <w:b/>
         </w:rPr>
-        <w:fldChar w:fldCharType="begin"/>
-      </w:r>
-      <w:r>
-        <w:rPr>
-          <w:b/>
-        </w:rPr>
-        <w:instrText>1 Court</w:instrText>
-      </w:r>
-      <w:r>
-        <w:rPr>
-          <w:b/>
-        </w:rPr>
-        <w:fldChar w:fldCharType="end"/>
+        <w:t>COURT</w:t>
       </w:r>
     </w:p>
     <w:p>
@@ -1147,6 +1135,7 @@
           <w:bCs/>
           <w:lang w:val="en-NZ"/>
         </w:rPr>
+        <w:spacing w:before="120" w:after="120"/>
       </w:pPr>
       <w:r>
         <w:rPr>
@@ -2267,7 +2256,7 @@
           <w:b/>
           <w:szCs w:val="23"/>
         </w:rPr>
-        <w:t>{{</w:t>
+        <w:t>Applicant </w:t>
       </w:r>
       <w:proofErr w:type="spellStart"/>
       <w:r>
@@ -2276,7 +2265,7 @@
           <w:b/>
           <w:szCs w:val="23"/>
         </w:rPr>
-        <w:t>Applicant_Name</w:t>
+        <w:t/>
       </w:r>
       <w:proofErr w:type="spellEnd"/>
       <w:r>
@@ -2285,13 +2274,13 @@
           <w:b/>
           <w:szCs w:val="23"/>
         </w:rPr>
-        <w:t>}}</w:t>
-      </w:r>
-      <w:r>
-        <w:rPr>
-          <w:b/>
-        </w:rPr>
-        <w:t xml:space="preserve"> </w:t>
+        <w:t/>
+      </w:r>
+      <w:r>
+        <w:rPr>
+          <w:b/>
+        </w:rPr>
+        <w:t xml:space="preserve"/>
       </w:r>
     </w:p>
     <w:p>

</xml_diff>